<commit_message>
Update AquiferOpenStudyNotes content for 2026-08-24 release
</commit_message>
<xml_diff>
--- a/arb/docx/31.content.docx
+++ b/arb/docx/31.content.docx
@@ -9,6 +9,8 @@
       </w:pPr>
       <w:r>
         <w:rPr>
+          <w:rtl/>
+          <w:cs/>
           <w:lang w:val="ar_AE" w:bidi="ar_AE"/>
         </w:rPr>
       </w:r>
@@ -20,12 +22,16 @@
       </w:pPr>
       <w:r>
         <w:rPr>
+          <w:rtl/>
+          <w:cs/>
           <w:lang w:val="ar_AE" w:bidi="ar_AE"/>
         </w:rPr>
         <w:t>Resource: Aquifer Open Study Notes</w:t>
       </w:r>
       <w:r>
         <w:rPr>
+          <w:rtl/>
+          <w:cs/>
           <w:lang w:val="ar_AE" w:bidi="ar_AE"/>
         </w:rPr>
       </w:r>
@@ -36,12 +42,16 @@
       </w:pPr>
       <w:r>
         <w:rPr>
+          <w:rtl/>
+          <w:cs/>
           <w:lang w:val="ar_AE" w:bidi="ar_AE"/>
         </w:rPr>
       </w:r>
       <w:r>
         <w:rPr>
           <w:b/>
+          <w:rtl/>
+          <w:cs/>
           <w:lang w:val="ar_AE" w:bidi="ar_AE"/>
         </w:rPr>
         <w:t>Aquifer Open Study Notes</w:t>
@@ -53,35 +63,47 @@
       </w:pPr>
       <w:r>
         <w:rPr>
-          <w:lang w:val="ar_AE" w:bidi="ar_AE"/>
-        </w:rPr>
-      </w:r>
-      <w:r>
-        <w:rPr>
+          <w:rtl/>
+          <w:cs/>
+          <w:lang w:val="ar_AE" w:bidi="ar_AE"/>
+        </w:rPr>
+      </w:r>
+      <w:r>
+        <w:rPr>
+          <w:rtl/>
+          <w:cs/>
           <w:lang w:val="ar_AE" w:bidi="ar_AE"/>
         </w:rPr>
         <w:t xml:space="preserve">This work is an adaptation of </w:t>
       </w:r>
       <w:r>
         <w:rPr>
+          <w:rtl/>
+          <w:cs/>
           <w:lang w:val="ar_AE" w:bidi="ar_AE"/>
         </w:rPr>
         <w:t>Tyndale Open Study Notes</w:t>
       </w:r>
       <w:r>
         <w:rPr>
+          <w:rtl/>
+          <w:cs/>
           <w:lang w:val="ar_AE" w:bidi="ar_AE"/>
         </w:rPr>
         <w:t xml:space="preserve"> © 2023 Tyndale House Publishers, licensed under the CC BY-SA 4.0 license. The adaptation, </w:t>
       </w:r>
       <w:r>
         <w:rPr>
+          <w:rtl/>
+          <w:cs/>
           <w:lang w:val="ar_AE" w:bidi="ar_AE"/>
         </w:rPr>
         <w:t>Aquifer Open Study Notes</w:t>
       </w:r>
       <w:r>
         <w:rPr>
+          <w:rtl/>
+          <w:cs/>
           <w:lang w:val="ar_AE" w:bidi="ar_AE"/>
         </w:rPr>
         <w:t>, was created by Mission Mutual and is also licensed under CC BY-SA 4.0.</w:t>
@@ -93,22 +115,30 @@
       </w:pPr>
       <w:r>
         <w:rPr>
-          <w:lang w:val="ar_AE" w:bidi="ar_AE"/>
-        </w:rPr>
-      </w:r>
-      <w:r>
-        <w:rPr>
+          <w:rtl/>
+          <w:cs/>
+          <w:lang w:val="ar_AE" w:bidi="ar_AE"/>
+        </w:rPr>
+      </w:r>
+      <w:r>
+        <w:rPr>
+          <w:rtl/>
+          <w:cs/>
           <w:lang w:val="ar_AE" w:bidi="ar_AE"/>
         </w:rPr>
         <w:t>This resource has been adapted into multiple languages, including English, Tok Pisin, Arabic (عربي), French (Français), Hindi (हिंदी), Indonesian (Bahasa Indonesia), Portuguese (Português), Russian (Русский), Spanish (Español), Swahili (Kiswahili), and Simplified Chinese (简体中文).</w:t>
       </w:r>
       <w:r>
         <w:rPr>
-          <w:lang w:val="ar_AE" w:bidi="ar_AE"/>
-        </w:rPr>
-      </w:r>
-      <w:r>
-        <w:rPr>
+          <w:rtl/>
+          <w:cs/>
+          <w:lang w:val="ar_AE" w:bidi="ar_AE"/>
+        </w:rPr>
+      </w:r>
+      <w:r>
+        <w:rPr>
+          <w:rtl/>
+          <w:cs/>
           <w:lang w:val="ar_AE" w:bidi="ar_AE"/>
         </w:rPr>
       </w:r>
@@ -120,6 +150,8 @@
       </w:pPr>
       <w:r>
         <w:rPr>
+          <w:rtl/>
+          <w:cs/>
           <w:lang w:val="ar_AE" w:bidi="ar_AE"/>
         </w:rPr>
         <w:t>Aquifer Open Study Notes</w:t>
@@ -149,6 +181,8 @@
       </w:pPr>
       <w:r>
         <w:rPr>
+          <w:rtl/>
+          <w:cs/>
           <w:lang w:val="ar_AE" w:bidi="ar_AE"/>
         </w:rPr>
       </w:r>
@@ -160,12 +194,16 @@
       </w:pPr>
       <w:r>
         <w:rPr>
+          <w:rtl/>
+          <w:cs/>
           <w:lang w:val="ar_AE" w:bidi="ar_AE"/>
         </w:rPr>
         <w:t>OBA</w:t>
       </w:r>
       <w:r>
         <w:rPr>
+          <w:rtl/>
+          <w:cs/>
           <w:lang w:val="ar_AE" w:bidi="ar_AE"/>
         </w:rPr>
       </w:r>
@@ -176,22 +214,30 @@
       </w:pPr>
       <w:r>
         <w:rPr>
-          <w:lang w:val="ar_AE" w:bidi="ar_AE"/>
-        </w:rPr>
-      </w:r>
-      <w:r>
-        <w:rPr>
+          <w:rtl/>
+          <w:cs/>
+          <w:lang w:val="ar_AE" w:bidi="ar_AE"/>
+        </w:rPr>
+      </w:r>
+      <w:r>
+        <w:rPr>
+          <w:rtl/>
+          <w:cs/>
           <w:lang w:val="ar_AE" w:bidi="ar_AE"/>
         </w:rPr>
         <w:t xml:space="preserve"> </w:t>
       </w:r>
       <w:r>
         <w:rPr>
-          <w:lang w:val="ar_AE" w:bidi="ar_AE"/>
-        </w:rPr>
-      </w:r>
-      <w:r>
-        <w:rPr>
+          <w:rtl/>
+          <w:cs/>
+          <w:lang w:val="ar_AE" w:bidi="ar_AE"/>
+        </w:rPr>
+      </w:r>
+      <w:r>
+        <w:rPr>
+          <w:rtl/>
+          <w:cs/>
           <w:lang w:val="ar_AE" w:bidi="ar_AE"/>
         </w:rPr>
       </w:r>
@@ -217,6 +263,8 @@
       </w:pPr>
       <w:r>
         <w:rPr>
+          <w:rtl/>
+          <w:cs/>
           <w:lang w:val="ar_AE" w:bidi="ar_AE"/>
         </w:rPr>
       </w:r>
@@ -228,12 +276,16 @@
       </w:pPr>
       <w:r>
         <w:rPr>
+          <w:rtl/>
+          <w:cs/>
           <w:lang w:val="ar_AE" w:bidi="ar_AE"/>
         </w:rPr>
         <w:t>عوبديا ١: ١</w:t>
       </w:r>
       <w:r>
         <w:rPr>
+          <w:rtl/>
+          <w:cs/>
           <w:lang w:val="ar_AE" w:bidi="ar_AE"/>
         </w:rPr>
       </w:r>
@@ -244,11 +296,15 @@
       </w:pPr>
       <w:r>
         <w:rPr>
-          <w:lang w:val="ar_AE" w:bidi="ar_AE"/>
-        </w:rPr>
-      </w:r>
-      <w:r>
-        <w:rPr>
+          <w:rtl/>
+          <w:cs/>
+          <w:lang w:val="ar_AE" w:bidi="ar_AE"/>
+        </w:rPr>
+      </w:r>
+      <w:r>
+        <w:rPr>
+          <w:rtl/>
+          <w:cs/>
           <w:lang w:val="ar_AE" w:bidi="ar_AE"/>
         </w:rPr>
         <w:t>تُستخدم كلمة رؤيا كمقدمة لبعض الأسفار النبوية (</w:t>
@@ -256,6 +312,8 @@
       <w:hyperlink r:id="rId13">
         <w:r>
           <w:rPr>
+            <w:rtl/>
+            <w:cs/>
             <w:lang w:val="ar_AE" w:bidi="ar_AE"/>
           </w:rPr>
           <w:rPr>
@@ -267,6 +325,8 @@
       </w:hyperlink>
       <w:r>
         <w:rPr>
+          <w:rtl/>
+          <w:cs/>
           <w:lang w:val="ar_AE" w:bidi="ar_AE"/>
         </w:rPr>
         <w:t xml:space="preserve">؛ </w:t>
@@ -274,6 +334,8 @@
       <w:hyperlink r:id="rId14">
         <w:r>
           <w:rPr>
+            <w:rtl/>
+            <w:cs/>
             <w:lang w:val="ar_AE" w:bidi="ar_AE"/>
           </w:rPr>
           <w:rPr>
@@ -285,6 +347,8 @@
       </w:hyperlink>
       <w:r>
         <w:rPr>
+          <w:rtl/>
+          <w:cs/>
           <w:lang w:val="ar_AE" w:bidi="ar_AE"/>
         </w:rPr>
         <w:t>)؛ كما أنها تُحدد ما رآه النبي أو شعر به من وحي إلهي (</w:t>
@@ -292,6 +356,8 @@
       <w:hyperlink r:id="rId15">
         <w:r>
           <w:rPr>
+            <w:rtl/>
+            <w:cs/>
             <w:lang w:val="ar_AE" w:bidi="ar_AE"/>
           </w:rPr>
           <w:rPr>
@@ -303,6 +369,8 @@
       </w:hyperlink>
       <w:r>
         <w:rPr>
+          <w:rtl/>
+          <w:cs/>
           <w:lang w:val="ar_AE" w:bidi="ar_AE"/>
         </w:rPr>
         <w:t xml:space="preserve">؛ </w:t>
@@ -310,6 +378,8 @@
       <w:hyperlink r:id="rId16">
         <w:r>
           <w:rPr>
+            <w:rtl/>
+            <w:cs/>
             <w:lang w:val="ar_AE" w:bidi="ar_AE"/>
           </w:rPr>
           <w:rPr>
@@ -321,6 +391,8 @@
       </w:hyperlink>
       <w:r>
         <w:rPr>
+          <w:rtl/>
+          <w:cs/>
           <w:lang w:val="ar_AE" w:bidi="ar_AE"/>
         </w:rPr>
         <w:t>). الرؤيا التي لم يكن مصدرها الرب كانت زائفة (</w:t>
@@ -328,6 +400,8 @@
       <w:hyperlink r:id="rId17">
         <w:r>
           <w:rPr>
+            <w:rtl/>
+            <w:cs/>
             <w:lang w:val="ar_AE" w:bidi="ar_AE"/>
           </w:rPr>
           <w:rPr>
@@ -339,6 +413,8 @@
       </w:hyperlink>
       <w:r>
         <w:rPr>
+          <w:rtl/>
+          <w:cs/>
           <w:lang w:val="ar_AE" w:bidi="ar_AE"/>
         </w:rPr>
         <w:t xml:space="preserve">؛ </w:t>
@@ -346,6 +422,8 @@
       <w:hyperlink r:id="rId18">
         <w:r>
           <w:rPr>
+            <w:rtl/>
+            <w:cs/>
             <w:lang w:val="ar_AE" w:bidi="ar_AE"/>
           </w:rPr>
           <w:rPr>
@@ -357,6 +435,8 @@
       </w:hyperlink>
       <w:r>
         <w:rPr>
+          <w:rtl/>
+          <w:cs/>
           <w:lang w:val="ar_AE" w:bidi="ar_AE"/>
         </w:rPr>
         <w:t>)، والدليل النهائي على ذلك هو عدم تحققها (</w:t>
@@ -364,6 +444,8 @@
       <w:hyperlink r:id="rId19">
         <w:r>
           <w:rPr>
+            <w:rtl/>
+            <w:cs/>
             <w:lang w:val="ar_AE" w:bidi="ar_AE"/>
           </w:rPr>
           <w:rPr>
@@ -375,6 +457,8 @@
       </w:hyperlink>
       <w:r>
         <w:rPr>
+          <w:rtl/>
+          <w:cs/>
           <w:lang w:val="ar_AE" w:bidi="ar_AE"/>
         </w:rPr>
         <w:t>). بالمقابل، الرؤى الحقيقية للأحداث القريبة أو البعيدة نجدها قد تحققت فعليًا (</w:t>
@@ -382,6 +466,8 @@
       <w:hyperlink r:id="rId20">
         <w:r>
           <w:rPr>
+            <w:rtl/>
+            <w:cs/>
             <w:lang w:val="ar_AE" w:bidi="ar_AE"/>
           </w:rPr>
           <w:rPr>
@@ -393,6 +479,8 @@
       </w:hyperlink>
       <w:r>
         <w:rPr>
+          <w:rtl/>
+          <w:cs/>
           <w:lang w:val="ar_AE" w:bidi="ar_AE"/>
         </w:rPr>
         <w:t xml:space="preserve">؛ </w:t>
@@ -400,6 +488,8 @@
       <w:hyperlink r:id="rId21">
         <w:r>
           <w:rPr>
+            <w:rtl/>
+            <w:cs/>
             <w:lang w:val="ar_AE" w:bidi="ar_AE"/>
           </w:rPr>
           <w:rPr>
@@ -411,6 +501,8 @@
       </w:hyperlink>
       <w:r>
         <w:rPr>
+          <w:rtl/>
+          <w:cs/>
           <w:lang w:val="ar_AE" w:bidi="ar_AE"/>
         </w:rPr>
         <w:t xml:space="preserve">). جاءت الرؤى النبوية بأشكال مختلفة (أحلام، أو إعلانات خارقة للطبيعة؛ مثلًا، </w:t>
@@ -418,6 +510,8 @@
       <w:hyperlink r:id="rId22">
         <w:r>
           <w:rPr>
+            <w:rtl/>
+            <w:cs/>
             <w:lang w:val="ar_AE" w:bidi="ar_AE"/>
           </w:rPr>
           <w:rPr>
@@ -429,6 +523,8 @@
       </w:hyperlink>
       <w:r>
         <w:rPr>
+          <w:rtl/>
+          <w:cs/>
           <w:lang w:val="ar_AE" w:bidi="ar_AE"/>
         </w:rPr>
         <w:t>). غياب الرؤى هو علامة على الترك الإلهي (</w:t>
@@ -436,6 +532,8 @@
       <w:hyperlink r:id="rId23">
         <w:r>
           <w:rPr>
+            <w:rtl/>
+            <w:cs/>
             <w:lang w:val="ar_AE" w:bidi="ar_AE"/>
           </w:rPr>
           <w:rPr>
@@ -447,6 +545,8 @@
       </w:hyperlink>
       <w:r>
         <w:rPr>
+          <w:rtl/>
+          <w:cs/>
           <w:lang w:val="ar_AE" w:bidi="ar_AE"/>
         </w:rPr>
         <w:t xml:space="preserve">؛ </w:t>
@@ -454,6 +554,8 @@
       <w:hyperlink r:id="rId24">
         <w:r>
           <w:rPr>
+            <w:rtl/>
+            <w:cs/>
             <w:lang w:val="ar_AE" w:bidi="ar_AE"/>
           </w:rPr>
           <w:rPr>
@@ -465,6 +567,8 @@
       </w:hyperlink>
       <w:r>
         <w:rPr>
+          <w:rtl/>
+          <w:cs/>
           <w:lang w:val="ar_AE" w:bidi="ar_AE"/>
         </w:rPr>
         <w:t xml:space="preserve"> </w:t>
@@ -472,6 +576,8 @@
       <w:hyperlink r:id="rId25">
         <w:r>
           <w:rPr>
+            <w:rtl/>
+            <w:cs/>
             <w:lang w:val="ar_AE" w:bidi="ar_AE"/>
           </w:rPr>
           <w:rPr>
@@ -483,6 +589,8 @@
       </w:hyperlink>
       <w:r>
         <w:rPr>
+          <w:rtl/>
+          <w:cs/>
           <w:lang w:val="ar_AE" w:bidi="ar_AE"/>
         </w:rPr>
         <w:t>). • الرب السيد هو أحد الأسماء المعلنة لإله بني إسرائيل. • عوبديا كان اسمًا عبريًا شائعًا يُعني "خادم الرب". لا يُذكر النبي عوبديا خارج أسفار الكتاب المقدس. • وأٌرسل رسول بين الأمم: في الحروب القديمة، كان يتم الاتصال بالحلفاء للانضمام إلى تحالف عسكري إما لمعاقبة عدو أو التصدي لهجوم. هنا يدعو السيد الرب الأمم لرد شر أدوم المتعجرف. • لنقم عليها: هذا تحالف طوعي، غير أن المفارقة الساخرة، أن لاحقًا عملهم سيرتد على رأسهم (</w:t>
@@ -490,6 +598,8 @@
       <w:hyperlink r:id="rId26">
         <w:r>
           <w:rPr>
+            <w:rtl/>
+            <w:cs/>
             <w:lang w:val="ar_AE" w:bidi="ar_AE"/>
           </w:rPr>
           <w:rPr>
@@ -501,17 +611,23 @@
       </w:hyperlink>
       <w:r>
         <w:rPr>
+          <w:rtl/>
+          <w:cs/>
           <w:lang w:val="ar_AE" w:bidi="ar_AE"/>
         </w:rPr>
         <w:t>).</w:t>
       </w:r>
       <w:r>
         <w:rPr>
-          <w:lang w:val="ar_AE" w:bidi="ar_AE"/>
-        </w:rPr>
-      </w:r>
-      <w:r>
-        <w:rPr>
+          <w:rtl/>
+          <w:cs/>
+          <w:lang w:val="ar_AE" w:bidi="ar_AE"/>
+        </w:rPr>
+      </w:r>
+      <w:r>
+        <w:rPr>
+          <w:rtl/>
+          <w:cs/>
           <w:lang w:val="ar_AE" w:bidi="ar_AE"/>
         </w:rPr>
       </w:r>
@@ -522,6 +638,8 @@
       </w:pPr>
       <w:r>
         <w:rPr>
+          <w:rtl/>
+          <w:cs/>
           <w:lang w:val="ar_AE" w:bidi="ar_AE"/>
         </w:rPr>
       </w:r>
@@ -533,12 +651,16 @@
       </w:pPr>
       <w:r>
         <w:rPr>
+          <w:rtl/>
+          <w:cs/>
           <w:lang w:val="ar_AE" w:bidi="ar_AE"/>
         </w:rPr>
         <w:t>عوبديا 1: 2–4</w:t>
       </w:r>
       <w:r>
         <w:rPr>
+          <w:rtl/>
+          <w:cs/>
           <w:lang w:val="ar_AE" w:bidi="ar_AE"/>
         </w:rPr>
       </w:r>
@@ -549,11 +671,15 @@
       </w:pPr>
       <w:r>
         <w:rPr>
-          <w:lang w:val="ar_AE" w:bidi="ar_AE"/>
-        </w:rPr>
-      </w:r>
-      <w:r>
-        <w:rPr>
+          <w:rtl/>
+          <w:cs/>
+          <w:lang w:val="ar_AE" w:bidi="ar_AE"/>
+        </w:rPr>
+      </w:r>
+      <w:r>
+        <w:rPr>
+          <w:rtl/>
+          <w:cs/>
           <w:lang w:val="ar_AE" w:bidi="ar_AE"/>
         </w:rPr>
         <w:t>إني قد جعلتك صغيرًا بين الأمم: تتعاقب رسائل الدينونة التي تُسجل خطايا أدوم المحددة ضد شعب إسرائيل (</w:t>
@@ -561,6 +687,8 @@
       <w:hyperlink r:id="rId27">
         <w:r>
           <w:rPr>
+            <w:rtl/>
+            <w:cs/>
             <w:lang w:val="ar_AE" w:bidi="ar_AE"/>
           </w:rPr>
           <w:rPr>
@@ -572,6 +700,8 @@
       </w:hyperlink>
       <w:r>
         <w:rPr>
+          <w:rtl/>
+          <w:cs/>
           <w:lang w:val="ar_AE" w:bidi="ar_AE"/>
         </w:rPr>
         <w:t xml:space="preserve"> </w:t>
@@ -579,6 +709,8 @@
       <w:hyperlink r:id="rId28">
         <w:r>
           <w:rPr>
+            <w:rtl/>
+            <w:cs/>
             <w:lang w:val="ar_AE" w:bidi="ar_AE"/>
           </w:rPr>
           <w:rPr>
@@ -590,6 +722,8 @@
       </w:hyperlink>
       <w:r>
         <w:rPr>
+          <w:rtl/>
+          <w:cs/>
           <w:lang w:val="ar_AE" w:bidi="ar_AE"/>
         </w:rPr>
         <w:t xml:space="preserve"> </w:t>
@@ -597,6 +731,8 @@
       <w:hyperlink r:id="rId29">
         <w:r>
           <w:rPr>
+            <w:rtl/>
+            <w:cs/>
             <w:lang w:val="ar_AE" w:bidi="ar_AE"/>
           </w:rPr>
           <w:rPr>
@@ -608,6 +744,8 @@
       </w:hyperlink>
       <w:r>
         <w:rPr>
+          <w:rtl/>
+          <w:cs/>
           <w:lang w:val="ar_AE" w:bidi="ar_AE"/>
         </w:rPr>
         <w:t xml:space="preserve"> </w:t>
@@ -615,6 +753,8 @@
       <w:hyperlink r:id="rId30">
         <w:r>
           <w:rPr>
+            <w:rtl/>
+            <w:cs/>
             <w:lang w:val="ar_AE" w:bidi="ar_AE"/>
           </w:rPr>
           <w:rPr>
@@ -626,6 +766,8 @@
       </w:hyperlink>
       <w:r>
         <w:rPr>
+          <w:rtl/>
+          <w:cs/>
           <w:lang w:val="ar_AE" w:bidi="ar_AE"/>
         </w:rPr>
         <w:t>). كثيرًا ما يُذكر أدوم ضمن الأمم التي قاومت بني إسرائيل والرب (</w:t>
@@ -633,6 +775,8 @@
       <w:hyperlink r:id="rId31">
         <w:r>
           <w:rPr>
+            <w:rtl/>
+            <w:cs/>
             <w:lang w:val="ar_AE" w:bidi="ar_AE"/>
           </w:rPr>
           <w:rPr>
@@ -644,6 +788,8 @@
       </w:hyperlink>
       <w:r>
         <w:rPr>
+          <w:rtl/>
+          <w:cs/>
           <w:lang w:val="ar_AE" w:bidi="ar_AE"/>
         </w:rPr>
         <w:t xml:space="preserve"> </w:t>
@@ -651,6 +797,8 @@
       <w:hyperlink r:id="rId32">
         <w:r>
           <w:rPr>
+            <w:rtl/>
+            <w:cs/>
             <w:lang w:val="ar_AE" w:bidi="ar_AE"/>
           </w:rPr>
           <w:rPr>
@@ -662,6 +810,8 @@
       </w:hyperlink>
       <w:r>
         <w:rPr>
+          <w:rtl/>
+          <w:cs/>
           <w:lang w:val="ar_AE" w:bidi="ar_AE"/>
         </w:rPr>
         <w:t xml:space="preserve"> </w:t>
@@ -669,6 +819,8 @@
       <w:hyperlink r:id="rId33">
         <w:r>
           <w:rPr>
+            <w:rtl/>
+            <w:cs/>
             <w:lang w:val="ar_AE" w:bidi="ar_AE"/>
           </w:rPr>
           <w:rPr>
@@ -680,6 +832,8 @@
       </w:hyperlink>
       <w:r>
         <w:rPr>
+          <w:rtl/>
+          <w:cs/>
           <w:lang w:val="ar_AE" w:bidi="ar_AE"/>
         </w:rPr>
         <w:t>). • صغيرًا بين الأمم . . . تكبر قلبك: كانت تضاريس أدوم الصخرية شاهدة على كبرياءه، وحصونه الشامخة التي وفرت له الأمان نذيرًا بسقوطه المدوي. كان أمراء أدوم من أشد حكام الأمم تكبرًا (</w:t>
@@ -687,6 +841,8 @@
       <w:hyperlink r:id="rId34">
         <w:r>
           <w:rPr>
+            <w:rtl/>
+            <w:cs/>
             <w:lang w:val="ar_AE" w:bidi="ar_AE"/>
           </w:rPr>
           <w:rPr>
@@ -698,6 +854,8 @@
       </w:hyperlink>
       <w:r>
         <w:rPr>
+          <w:rtl/>
+          <w:cs/>
           <w:lang w:val="ar_AE" w:bidi="ar_AE"/>
         </w:rPr>
         <w:t xml:space="preserve"> قارن </w:t>
@@ -705,6 +863,8 @@
       <w:hyperlink r:id="rId35">
         <w:r>
           <w:rPr>
+            <w:rtl/>
+            <w:cs/>
             <w:lang w:val="ar_AE" w:bidi="ar_AE"/>
           </w:rPr>
           <w:rPr>
@@ -716,6 +876,8 @@
       </w:hyperlink>
       <w:r>
         <w:rPr>
+          <w:rtl/>
+          <w:cs/>
           <w:lang w:val="ar_AE" w:bidi="ar_AE"/>
         </w:rPr>
         <w:t xml:space="preserve"> </w:t>
@@ -723,6 +885,8 @@
       <w:hyperlink r:id="rId36">
         <w:r>
           <w:rPr>
+            <w:rtl/>
+            <w:cs/>
             <w:lang w:val="ar_AE" w:bidi="ar_AE"/>
           </w:rPr>
           <w:rPr>
@@ -734,17 +898,23 @@
       </w:hyperlink>
       <w:r>
         <w:rPr>
+          <w:rtl/>
+          <w:cs/>
           <w:lang w:val="ar_AE" w:bidi="ar_AE"/>
         </w:rPr>
         <w:t>).</w:t>
       </w:r>
       <w:r>
         <w:rPr>
-          <w:lang w:val="ar_AE" w:bidi="ar_AE"/>
-        </w:rPr>
-      </w:r>
-      <w:r>
-        <w:rPr>
+          <w:rtl/>
+          <w:cs/>
+          <w:lang w:val="ar_AE" w:bidi="ar_AE"/>
+        </w:rPr>
+      </w:r>
+      <w:r>
+        <w:rPr>
+          <w:rtl/>
+          <w:cs/>
           <w:lang w:val="ar_AE" w:bidi="ar_AE"/>
         </w:rPr>
       </w:r>
@@ -755,6 +925,8 @@
       </w:pPr>
       <w:r>
         <w:rPr>
+          <w:rtl/>
+          <w:cs/>
           <w:lang w:val="ar_AE" w:bidi="ar_AE"/>
         </w:rPr>
       </w:r>
@@ -766,12 +938,16 @@
       </w:pPr>
       <w:r>
         <w:rPr>
+          <w:rtl/>
+          <w:cs/>
           <w:lang w:val="ar_AE" w:bidi="ar_AE"/>
         </w:rPr>
         <w:t>عوبديا 1: 5</w:t>
       </w:r>
       <w:r>
         <w:rPr>
+          <w:rtl/>
+          <w:cs/>
           <w:lang w:val="ar_AE" w:bidi="ar_AE"/>
         </w:rPr>
       </w:r>
@@ -782,11 +958,15 @@
       </w:pPr>
       <w:r>
         <w:rPr>
-          <w:lang w:val="ar_AE" w:bidi="ar_AE"/>
-        </w:rPr>
-      </w:r>
-      <w:r>
-        <w:rPr>
+          <w:rtl/>
+          <w:cs/>
+          <w:lang w:val="ar_AE" w:bidi="ar_AE"/>
+        </w:rPr>
+      </w:r>
+      <w:r>
+        <w:rPr>
+          <w:rtl/>
+          <w:cs/>
           <w:lang w:val="ar_AE" w:bidi="ar_AE"/>
         </w:rPr>
         <w:t>كان مهلكو أدوم ينهبون كل شيء، بخلاف اللصوص والحصادين. فاللصوص كانوا يتركون ما قد يعيق فرارهم؛ بينما كان الحصادون يتركون دومًا بقايا للفقراء يلتقطونها (</w:t>
@@ -794,6 +974,8 @@
       <w:hyperlink r:id="rId37">
         <w:r>
           <w:rPr>
+            <w:rtl/>
+            <w:cs/>
             <w:lang w:val="ar_AE" w:bidi="ar_AE"/>
           </w:rPr>
           <w:rPr>
@@ -805,6 +987,8 @@
       </w:hyperlink>
       <w:r>
         <w:rPr>
+          <w:rtl/>
+          <w:cs/>
           <w:lang w:val="ar_AE" w:bidi="ar_AE"/>
         </w:rPr>
         <w:t xml:space="preserve">؛ قارن </w:t>
@@ -812,6 +996,8 @@
       <w:hyperlink r:id="rId38">
         <w:r>
           <w:rPr>
+            <w:rtl/>
+            <w:cs/>
             <w:lang w:val="ar_AE" w:bidi="ar_AE"/>
           </w:rPr>
           <w:rPr>
@@ -823,6 +1009,8 @@
       </w:hyperlink>
       <w:r>
         <w:rPr>
+          <w:rtl/>
+          <w:cs/>
           <w:lang w:val="ar_AE" w:bidi="ar_AE"/>
         </w:rPr>
         <w:t xml:space="preserve">؛ </w:t>
@@ -830,6 +1018,8 @@
       <w:hyperlink r:id="rId39">
         <w:r>
           <w:rPr>
+            <w:rtl/>
+            <w:cs/>
             <w:lang w:val="ar_AE" w:bidi="ar_AE"/>
           </w:rPr>
           <w:rPr>
@@ -841,17 +1031,23 @@
       </w:hyperlink>
       <w:r>
         <w:rPr>
+          <w:rtl/>
+          <w:cs/>
           <w:lang w:val="ar_AE" w:bidi="ar_AE"/>
         </w:rPr>
         <w:t>).</w:t>
       </w:r>
       <w:r>
         <w:rPr>
-          <w:lang w:val="ar_AE" w:bidi="ar_AE"/>
-        </w:rPr>
-      </w:r>
-      <w:r>
-        <w:rPr>
+          <w:rtl/>
+          <w:cs/>
+          <w:lang w:val="ar_AE" w:bidi="ar_AE"/>
+        </w:rPr>
+      </w:r>
+      <w:r>
+        <w:rPr>
+          <w:rtl/>
+          <w:cs/>
           <w:lang w:val="ar_AE" w:bidi="ar_AE"/>
         </w:rPr>
       </w:r>
@@ -862,6 +1058,8 @@
       </w:pPr>
       <w:r>
         <w:rPr>
+          <w:rtl/>
+          <w:cs/>
           <w:lang w:val="ar_AE" w:bidi="ar_AE"/>
         </w:rPr>
       </w:r>
@@ -873,12 +1071,16 @@
       </w:pPr>
       <w:r>
         <w:rPr>
+          <w:rtl/>
+          <w:cs/>
           <w:lang w:val="ar_AE" w:bidi="ar_AE"/>
         </w:rPr>
         <w:t>عوبديا 1 :5–7</w:t>
       </w:r>
       <w:r>
         <w:rPr>
+          <w:rtl/>
+          <w:cs/>
           <w:lang w:val="ar_AE" w:bidi="ar_AE"/>
         </w:rPr>
       </w:r>
@@ -889,11 +1091,15 @@
       </w:pPr>
       <w:r>
         <w:rPr>
-          <w:lang w:val="ar_AE" w:bidi="ar_AE"/>
-        </w:rPr>
-      </w:r>
-      <w:r>
-        <w:rPr>
+          <w:rtl/>
+          <w:cs/>
+          <w:lang w:val="ar_AE" w:bidi="ar_AE"/>
+        </w:rPr>
+      </w:r>
+      <w:r>
+        <w:rPr>
+          <w:rtl/>
+          <w:cs/>
           <w:lang w:val="ar_AE" w:bidi="ar_AE"/>
         </w:rPr>
         <w:t xml:space="preserve">دمر البابليون أورشليم تدميرًا كاملًا. وبمشاركته في نهب الغنائم، استحق أدوم عقابًا مماثلًا (انظر </w:t>
@@ -901,6 +1107,8 @@
       <w:hyperlink r:id="rId40">
         <w:r>
           <w:rPr>
+            <w:rtl/>
+            <w:cs/>
             <w:lang w:val="ar_AE" w:bidi="ar_AE"/>
           </w:rPr>
           <w:rPr>
@@ -912,17 +1120,23 @@
       </w:hyperlink>
       <w:r>
         <w:rPr>
+          <w:rtl/>
+          <w:cs/>
           <w:lang w:val="ar_AE" w:bidi="ar_AE"/>
         </w:rPr>
         <w:t>).</w:t>
       </w:r>
       <w:r>
         <w:rPr>
-          <w:lang w:val="ar_AE" w:bidi="ar_AE"/>
-        </w:rPr>
-      </w:r>
-      <w:r>
-        <w:rPr>
+          <w:rtl/>
+          <w:cs/>
+          <w:lang w:val="ar_AE" w:bidi="ar_AE"/>
+        </w:rPr>
+      </w:r>
+      <w:r>
+        <w:rPr>
+          <w:rtl/>
+          <w:cs/>
           <w:lang w:val="ar_AE" w:bidi="ar_AE"/>
         </w:rPr>
       </w:r>
@@ -933,6 +1147,8 @@
       </w:pPr>
       <w:r>
         <w:rPr>
+          <w:rtl/>
+          <w:cs/>
           <w:lang w:val="ar_AE" w:bidi="ar_AE"/>
         </w:rPr>
       </w:r>
@@ -944,12 +1160,16 @@
       </w:pPr>
       <w:r>
         <w:rPr>
+          <w:rtl/>
+          <w:cs/>
           <w:lang w:val="ar_AE" w:bidi="ar_AE"/>
         </w:rPr>
         <w:t>عوبديا 1: 6</w:t>
       </w:r>
       <w:r>
         <w:rPr>
+          <w:rtl/>
+          <w:cs/>
           <w:lang w:val="ar_AE" w:bidi="ar_AE"/>
         </w:rPr>
       </w:r>
@@ -960,11 +1180,15 @@
       </w:pPr>
       <w:r>
         <w:rPr>
-          <w:lang w:val="ar_AE" w:bidi="ar_AE"/>
-        </w:rPr>
-      </w:r>
-      <w:r>
-        <w:rPr>
+          <w:rtl/>
+          <w:cs/>
+          <w:lang w:val="ar_AE" w:bidi="ar_AE"/>
+        </w:rPr>
+      </w:r>
+      <w:r>
+        <w:rPr>
+          <w:rtl/>
+          <w:cs/>
           <w:lang w:val="ar_AE" w:bidi="ar_AE"/>
         </w:rPr>
         <w:t>أدوم: يستخدم النص العبري اسم عيسو، أخي يعقوب، للدلالة على انتهاك أدوم للعلاقة الأخوية (</w:t>
@@ -972,6 +1196,8 @@
       <w:hyperlink r:id="rId27">
         <w:r>
           <w:rPr>
+            <w:rtl/>
+            <w:cs/>
             <w:lang w:val="ar_AE" w:bidi="ar_AE"/>
           </w:rPr>
           <w:rPr>
@@ -983,17 +1209,23 @@
       </w:hyperlink>
       <w:r>
         <w:rPr>
+          <w:rtl/>
+          <w:cs/>
           <w:lang w:val="ar_AE" w:bidi="ar_AE"/>
         </w:rPr>
         <w:t>).</w:t>
       </w:r>
       <w:r>
         <w:rPr>
-          <w:lang w:val="ar_AE" w:bidi="ar_AE"/>
-        </w:rPr>
-      </w:r>
-      <w:r>
-        <w:rPr>
+          <w:rtl/>
+          <w:cs/>
+          <w:lang w:val="ar_AE" w:bidi="ar_AE"/>
+        </w:rPr>
+      </w:r>
+      <w:r>
+        <w:rPr>
+          <w:rtl/>
+          <w:cs/>
           <w:lang w:val="ar_AE" w:bidi="ar_AE"/>
         </w:rPr>
       </w:r>
@@ -1004,6 +1236,8 @@
       </w:pPr>
       <w:r>
         <w:rPr>
+          <w:rtl/>
+          <w:cs/>
           <w:lang w:val="ar_AE" w:bidi="ar_AE"/>
         </w:rPr>
       </w:r>
@@ -1015,12 +1249,16 @@
       </w:pPr>
       <w:r>
         <w:rPr>
+          <w:rtl/>
+          <w:cs/>
           <w:lang w:val="ar_AE" w:bidi="ar_AE"/>
         </w:rPr>
         <w:t>عوبديا 1: 7</w:t>
       </w:r>
       <w:r>
         <w:rPr>
+          <w:rtl/>
+          <w:cs/>
           <w:lang w:val="ar_AE" w:bidi="ar_AE"/>
         </w:rPr>
       </w:r>
@@ -1031,11 +1269,15 @@
       </w:pPr>
       <w:r>
         <w:rPr>
-          <w:lang w:val="ar_AE" w:bidi="ar_AE"/>
-        </w:rPr>
-      </w:r>
-      <w:r>
-        <w:rPr>
+          <w:rtl/>
+          <w:cs/>
+          <w:lang w:val="ar_AE" w:bidi="ar_AE"/>
+        </w:rPr>
+      </w:r>
+      <w:r>
+        <w:rPr>
+          <w:rtl/>
+          <w:cs/>
           <w:lang w:val="ar_AE" w:bidi="ar_AE"/>
         </w:rPr>
         <w:t xml:space="preserve">كل معاهديك (تُعني حرفيًا </w:t>
@@ -1043,12 +1285,16 @@
       <w:r>
         <w:rPr>
           <w:i/>
+          <w:rtl/>
+          <w:cs/>
           <w:lang w:val="ar_AE" w:bidi="ar_AE"/>
         </w:rPr>
         <w:t>أصحاب العهد</w:t>
       </w:r>
       <w:r>
         <w:rPr>
+          <w:rtl/>
+          <w:cs/>
           <w:lang w:val="ar_AE" w:bidi="ar_AE"/>
         </w:rPr>
         <w:t xml:space="preserve">): كان ينبغي أن يكون أدوم حليفًا لإسرائيل (أخيه). لكنه بدلًا من ذلك، أبرم عهدًا مع بابل. • مسالموك (تعني حرفيًا </w:t>
@@ -1056,23 +1302,31 @@
       <w:r>
         <w:rPr>
           <w:i/>
+          <w:rtl/>
+          <w:cs/>
           <w:lang w:val="ar_AE" w:bidi="ar_AE"/>
         </w:rPr>
         <w:t>أصحاب السلام</w:t>
       </w:r>
       <w:r>
         <w:rPr>
+          <w:rtl/>
+          <w:cs/>
           <w:lang w:val="ar_AE" w:bidi="ar_AE"/>
         </w:rPr>
         <w:t>، وتوازي التعبير السابق "كل معاهديك"): لقد كان العقاب من جنس العمل إذ خانت بابل أدوم، كما خان أدوم أخاه إسرائيل.</w:t>
       </w:r>
       <w:r>
         <w:rPr>
-          <w:lang w:val="ar_AE" w:bidi="ar_AE"/>
-        </w:rPr>
-      </w:r>
-      <w:r>
-        <w:rPr>
+          <w:rtl/>
+          <w:cs/>
+          <w:lang w:val="ar_AE" w:bidi="ar_AE"/>
+        </w:rPr>
+      </w:r>
+      <w:r>
+        <w:rPr>
+          <w:rtl/>
+          <w:cs/>
           <w:lang w:val="ar_AE" w:bidi="ar_AE"/>
         </w:rPr>
       </w:r>
@@ -1083,6 +1337,8 @@
       </w:pPr>
       <w:r>
         <w:rPr>
+          <w:rtl/>
+          <w:cs/>
           <w:lang w:val="ar_AE" w:bidi="ar_AE"/>
         </w:rPr>
       </w:r>
@@ -1094,12 +1350,16 @@
       </w:pPr>
       <w:r>
         <w:rPr>
+          <w:rtl/>
+          <w:cs/>
           <w:lang w:val="ar_AE" w:bidi="ar_AE"/>
         </w:rPr>
         <w:t>عوبديا 1: 8</w:t>
       </w:r>
       <w:r>
         <w:rPr>
+          <w:rtl/>
+          <w:cs/>
           <w:lang w:val="ar_AE" w:bidi="ar_AE"/>
         </w:rPr>
       </w:r>
@@ -1110,11 +1370,15 @@
       </w:pPr>
       <w:r>
         <w:rPr>
-          <w:lang w:val="ar_AE" w:bidi="ar_AE"/>
-        </w:rPr>
-      </w:r>
-      <w:r>
-        <w:rPr>
+          <w:rtl/>
+          <w:cs/>
+          <w:lang w:val="ar_AE" w:bidi="ar_AE"/>
+        </w:rPr>
+      </w:r>
+      <w:r>
+        <w:rPr>
+          <w:rtl/>
+          <w:cs/>
           <w:lang w:val="ar_AE" w:bidi="ar_AE"/>
         </w:rPr>
         <w:t>في ذلك اليوم: ترد الكلمة العبرية "يوم"</w:t>
@@ -1122,12 +1386,16 @@
       <w:r>
         <w:rPr>
           <w:i/>
+          <w:rtl/>
+          <w:cs/>
           <w:lang w:val="ar_AE" w:bidi="ar_AE"/>
         </w:rPr>
         <w:t xml:space="preserve"> </w:t>
       </w:r>
       <w:r>
         <w:rPr>
+          <w:rtl/>
+          <w:cs/>
           <w:lang w:val="ar_AE" w:bidi="ar_AE"/>
         </w:rPr>
         <w:t xml:space="preserve">اثنتي عشرة مرة في </w:t>
@@ -1135,6 +1403,8 @@
       <w:hyperlink r:id="rId41">
         <w:r>
           <w:rPr>
+            <w:rtl/>
+            <w:cs/>
             <w:lang w:val="ar_AE" w:bidi="ar_AE"/>
           </w:rPr>
           <w:rPr>
@@ -1146,6 +1416,8 @@
       </w:hyperlink>
       <w:r>
         <w:rPr>
+          <w:rtl/>
+          <w:cs/>
           <w:lang w:val="ar_AE" w:bidi="ar_AE"/>
         </w:rPr>
         <w:t xml:space="preserve">، وغالبًا ما تُترجم "عندما" أو "في ذلك الوقت". "اليوم" المشار إليه في </w:t>
@@ -1153,6 +1425,8 @@
       <w:hyperlink r:id="rId42">
         <w:r>
           <w:rPr>
+            <w:rtl/>
+            <w:cs/>
             <w:lang w:val="ar_AE" w:bidi="ar_AE"/>
           </w:rPr>
           <w:rPr>
@@ -1164,6 +1438,8 @@
       </w:hyperlink>
       <w:r>
         <w:rPr>
+          <w:rtl/>
+          <w:cs/>
           <w:lang w:val="ar_AE" w:bidi="ar_AE"/>
         </w:rPr>
         <w:t xml:space="preserve"> هو بداية النهاية، عندما يتدخل الله ليغير مصير شعبه. • الحكماء. . . والفهم: افتخر أدوم بحكمته المتوارثة (قارن </w:t>
@@ -1171,6 +1447,8 @@
       <w:hyperlink r:id="rId43">
         <w:r>
           <w:rPr>
+            <w:rtl/>
+            <w:cs/>
             <w:lang w:val="ar_AE" w:bidi="ar_AE"/>
           </w:rPr>
           <w:rPr>
@@ -1182,17 +1460,23 @@
       </w:hyperlink>
       <w:r>
         <w:rPr>
+          <w:rtl/>
+          <w:cs/>
           <w:lang w:val="ar_AE" w:bidi="ar_AE"/>
         </w:rPr>
         <w:t>). على سبيل المثال، جرت أحداث سفر أيوب في منطقة أدوم.</w:t>
       </w:r>
       <w:r>
         <w:rPr>
-          <w:lang w:val="ar_AE" w:bidi="ar_AE"/>
-        </w:rPr>
-      </w:r>
-      <w:r>
-        <w:rPr>
+          <w:rtl/>
+          <w:cs/>
+          <w:lang w:val="ar_AE" w:bidi="ar_AE"/>
+        </w:rPr>
+      </w:r>
+      <w:r>
+        <w:rPr>
+          <w:rtl/>
+          <w:cs/>
           <w:lang w:val="ar_AE" w:bidi="ar_AE"/>
         </w:rPr>
       </w:r>
@@ -1203,6 +1487,8 @@
       </w:pPr>
       <w:r>
         <w:rPr>
+          <w:rtl/>
+          <w:cs/>
           <w:lang w:val="ar_AE" w:bidi="ar_AE"/>
         </w:rPr>
       </w:r>
@@ -1214,12 +1500,16 @@
       </w:pPr>
       <w:r>
         <w:rPr>
+          <w:rtl/>
+          <w:cs/>
           <w:lang w:val="ar_AE" w:bidi="ar_AE"/>
         </w:rPr>
         <w:t>عوبديا 1: 10–14</w:t>
       </w:r>
       <w:r>
         <w:rPr>
+          <w:rtl/>
+          <w:cs/>
           <w:lang w:val="ar_AE" w:bidi="ar_AE"/>
         </w:rPr>
       </w:r>
@@ -1230,11 +1520,15 @@
       </w:pPr>
       <w:r>
         <w:rPr>
-          <w:lang w:val="ar_AE" w:bidi="ar_AE"/>
-        </w:rPr>
-      </w:r>
-      <w:r>
-        <w:rPr>
+          <w:rtl/>
+          <w:cs/>
+          <w:lang w:val="ar_AE" w:bidi="ar_AE"/>
+        </w:rPr>
+      </w:r>
+      <w:r>
+        <w:rPr>
+          <w:rtl/>
+          <w:cs/>
           <w:lang w:val="ar_AE" w:bidi="ar_AE"/>
         </w:rPr>
         <w:t xml:space="preserve">من أجل ظلمك لأخيك يعقوب: يوضح </w:t>
@@ -1242,6 +1536,8 @@
       <w:hyperlink r:id="rId44">
         <w:r>
           <w:rPr>
+            <w:rtl/>
+            <w:cs/>
             <w:lang w:val="ar_AE" w:bidi="ar_AE"/>
           </w:rPr>
           <w:rPr>
@@ -1253,6 +1549,8 @@
       </w:hyperlink>
       <w:r>
         <w:rPr>
+          <w:rtl/>
+          <w:cs/>
           <w:lang w:val="ar_AE" w:bidi="ar_AE"/>
         </w:rPr>
         <w:t xml:space="preserve"> السبب الذي من أجله أُدين عيسو (قارن </w:t>
@@ -1260,6 +1558,8 @@
       <w:hyperlink r:id="rId31">
         <w:r>
           <w:rPr>
+            <w:rtl/>
+            <w:cs/>
             <w:lang w:val="ar_AE" w:bidi="ar_AE"/>
           </w:rPr>
           <w:rPr>
@@ -1271,6 +1571,8 @@
       </w:hyperlink>
       <w:r>
         <w:rPr>
+          <w:rtl/>
+          <w:cs/>
           <w:lang w:val="ar_AE" w:bidi="ar_AE"/>
         </w:rPr>
         <w:t xml:space="preserve">؛ </w:t>
@@ -1278,6 +1580,8 @@
       <w:hyperlink r:id="rId28">
         <w:r>
           <w:rPr>
+            <w:rtl/>
+            <w:cs/>
             <w:lang w:val="ar_AE" w:bidi="ar_AE"/>
           </w:rPr>
           <w:rPr>
@@ -1289,6 +1593,8 @@
       </w:hyperlink>
       <w:r>
         <w:rPr>
+          <w:rtl/>
+          <w:cs/>
           <w:lang w:val="ar_AE" w:bidi="ar_AE"/>
         </w:rPr>
         <w:t xml:space="preserve">؛ </w:t>
@@ -1296,6 +1602,8 @@
       <w:hyperlink r:id="rId45">
         <w:r>
           <w:rPr>
+            <w:rtl/>
+            <w:cs/>
             <w:lang w:val="ar_AE" w:bidi="ar_AE"/>
           </w:rPr>
           <w:rPr>
@@ -1307,6 +1615,8 @@
       </w:hyperlink>
       <w:r>
         <w:rPr>
+          <w:rtl/>
+          <w:cs/>
           <w:lang w:val="ar_AE" w:bidi="ar_AE"/>
         </w:rPr>
         <w:t xml:space="preserve">؛ </w:t>
@@ -1314,6 +1624,8 @@
       <w:hyperlink r:id="rId46">
         <w:r>
           <w:rPr>
+            <w:rtl/>
+            <w:cs/>
             <w:lang w:val="ar_AE" w:bidi="ar_AE"/>
           </w:rPr>
           <w:rPr>
@@ -1325,6 +1637,8 @@
       </w:hyperlink>
       <w:r>
         <w:rPr>
+          <w:rtl/>
+          <w:cs/>
           <w:lang w:val="ar_AE" w:bidi="ar_AE"/>
         </w:rPr>
         <w:t xml:space="preserve">) وأُبرز السبب بمزيد من التفصيل في </w:t>
@@ -1332,6 +1646,8 @@
       <w:hyperlink r:id="rId47">
         <w:r>
           <w:rPr>
+            <w:rtl/>
+            <w:cs/>
             <w:lang w:val="ar_AE" w:bidi="ar_AE"/>
           </w:rPr>
           <w:rPr>
@@ -1343,17 +1659,23 @@
       </w:hyperlink>
       <w:r>
         <w:rPr>
+          <w:rtl/>
+          <w:cs/>
           <w:lang w:val="ar_AE" w:bidi="ar_AE"/>
         </w:rPr>
         <w:t>، حيث تُوصف خيانة أدوم. من الناحية القانونية، تبرهن هذه الآيات على نكث أدوم للعهد.</w:t>
       </w:r>
       <w:r>
         <w:rPr>
-          <w:lang w:val="ar_AE" w:bidi="ar_AE"/>
-        </w:rPr>
-      </w:r>
-      <w:r>
-        <w:rPr>
+          <w:rtl/>
+          <w:cs/>
+          <w:lang w:val="ar_AE" w:bidi="ar_AE"/>
+        </w:rPr>
+      </w:r>
+      <w:r>
+        <w:rPr>
+          <w:rtl/>
+          <w:cs/>
           <w:lang w:val="ar_AE" w:bidi="ar_AE"/>
         </w:rPr>
       </w:r>
@@ -1364,6 +1686,8 @@
       </w:pPr>
       <w:r>
         <w:rPr>
+          <w:rtl/>
+          <w:cs/>
           <w:lang w:val="ar_AE" w:bidi="ar_AE"/>
         </w:rPr>
       </w:r>
@@ -1375,12 +1699,16 @@
       </w:pPr>
       <w:r>
         <w:rPr>
+          <w:rtl/>
+          <w:cs/>
           <w:lang w:val="ar_AE" w:bidi="ar_AE"/>
         </w:rPr>
         <w:t>عوبديا 1: 11</w:t>
       </w:r>
       <w:r>
         <w:rPr>
+          <w:rtl/>
+          <w:cs/>
           <w:lang w:val="ar_AE" w:bidi="ar_AE"/>
         </w:rPr>
       </w:r>
@@ -1391,11 +1719,15 @@
       </w:pPr>
       <w:r>
         <w:rPr>
-          <w:lang w:val="ar_AE" w:bidi="ar_AE"/>
-        </w:rPr>
-      </w:r>
-      <w:r>
-        <w:rPr>
+          <w:rtl/>
+          <w:cs/>
+          <w:lang w:val="ar_AE" w:bidi="ar_AE"/>
+        </w:rPr>
+      </w:r>
+      <w:r>
+        <w:rPr>
+          <w:rtl/>
+          <w:cs/>
           <w:lang w:val="ar_AE" w:bidi="ar_AE"/>
         </w:rPr>
         <w:t xml:space="preserve">خارج هذا السفر، لا يُعرف شيء دقيق عن دور أدوم أثناء الغزوات البابلية المتعاقبة على يهوذا (في 605، 597، و586 قبل الميلاد). تُعد المسؤولية تجاه الجار مطلبًا محددًا في شريعة الله (مثل </w:t>
@@ -1403,6 +1735,8 @@
       <w:hyperlink r:id="rId48">
         <w:r>
           <w:rPr>
+            <w:rtl/>
+            <w:cs/>
             <w:lang w:val="ar_AE" w:bidi="ar_AE"/>
           </w:rPr>
           <w:rPr>
@@ -1414,6 +1748,8 @@
       </w:hyperlink>
       <w:r>
         <w:rPr>
+          <w:rtl/>
+          <w:cs/>
           <w:lang w:val="ar_AE" w:bidi="ar_AE"/>
         </w:rPr>
         <w:t xml:space="preserve">؛ قارن </w:t>
@@ -1421,6 +1757,8 @@
       <w:hyperlink r:id="rId49">
         <w:r>
           <w:rPr>
+            <w:rtl/>
+            <w:cs/>
             <w:lang w:val="ar_AE" w:bidi="ar_AE"/>
           </w:rPr>
           <w:rPr>
@@ -1432,6 +1770,8 @@
       </w:hyperlink>
       <w:r>
         <w:rPr>
+          <w:rtl/>
+          <w:cs/>
           <w:lang w:val="ar_AE" w:bidi="ar_AE"/>
         </w:rPr>
         <w:t>)، خاصة عندما تكون هناك إما "معاهدة أخوة" منصوص عليها (</w:t>
@@ -1439,6 +1779,8 @@
       <w:hyperlink r:id="rId50">
         <w:r>
           <w:rPr>
+            <w:rtl/>
+            <w:cs/>
             <w:lang w:val="ar_AE" w:bidi="ar_AE"/>
           </w:rPr>
           <w:rPr>
@@ -1450,29 +1792,39 @@
       </w:hyperlink>
       <w:r>
         <w:rPr>
+          <w:rtl/>
+          <w:cs/>
           <w:lang w:val="ar_AE" w:bidi="ar_AE"/>
         </w:rPr>
         <w:t xml:space="preserve">) أو صلة تاريخية تُعد بمثابة عِلاقة أخوية (انظر </w:t>
       </w:r>
       <w:r>
         <w:rPr>
+          <w:rtl/>
+          <w:cs/>
           <w:lang w:val="ar_AE" w:bidi="ar_AE"/>
         </w:rPr>
         <w:t>ملاحظة الدراسة على عوبديا 1 : 6</w:t>
       </w:r>
       <w:r>
         <w:rPr>
+          <w:rtl/>
+          <w:cs/>
           <w:lang w:val="ar_AE" w:bidi="ar_AE"/>
         </w:rPr>
         <w:t>).</w:t>
       </w:r>
       <w:r>
         <w:rPr>
-          <w:lang w:val="ar_AE" w:bidi="ar_AE"/>
-        </w:rPr>
-      </w:r>
-      <w:r>
-        <w:rPr>
+          <w:rtl/>
+          <w:cs/>
+          <w:lang w:val="ar_AE" w:bidi="ar_AE"/>
+        </w:rPr>
+      </w:r>
+      <w:r>
+        <w:rPr>
+          <w:rtl/>
+          <w:cs/>
           <w:lang w:val="ar_AE" w:bidi="ar_AE"/>
         </w:rPr>
       </w:r>
@@ -1483,6 +1835,8 @@
       </w:pPr>
       <w:r>
         <w:rPr>
+          <w:rtl/>
+          <w:cs/>
           <w:lang w:val="ar_AE" w:bidi="ar_AE"/>
         </w:rPr>
       </w:r>
@@ -1494,12 +1848,16 @@
       </w:pPr>
       <w:r>
         <w:rPr>
+          <w:rtl/>
+          <w:cs/>
           <w:lang w:val="ar_AE" w:bidi="ar_AE"/>
         </w:rPr>
         <w:t>عوبديا 1: 12</w:t>
       </w:r>
       <w:r>
         <w:rPr>
+          <w:rtl/>
+          <w:cs/>
           <w:lang w:val="ar_AE" w:bidi="ar_AE"/>
         </w:rPr>
       </w:r>
@@ -1510,11 +1868,15 @@
       </w:pPr>
       <w:r>
         <w:rPr>
-          <w:lang w:val="ar_AE" w:bidi="ar_AE"/>
-        </w:rPr>
-      </w:r>
-      <w:r>
-        <w:rPr>
+          <w:rtl/>
+          <w:cs/>
+          <w:lang w:val="ar_AE" w:bidi="ar_AE"/>
+        </w:rPr>
+      </w:r>
+      <w:r>
+        <w:rPr>
+          <w:rtl/>
+          <w:cs/>
           <w:lang w:val="ar_AE" w:bidi="ar_AE"/>
         </w:rPr>
         <w:t xml:space="preserve">كانت قبائل بني إسرائيل تربطها صلة قرابة بأدوم (الكلمة المستخدمة حرفيًا </w:t>
@@ -1522,12 +1884,16 @@
       <w:r>
         <w:rPr>
           <w:i/>
+          <w:rtl/>
+          <w:cs/>
           <w:lang w:val="ar_AE" w:bidi="ar_AE"/>
         </w:rPr>
         <w:t xml:space="preserve">أخ؛ </w:t>
       </w:r>
       <w:r>
         <w:rPr>
+          <w:rtl/>
+          <w:cs/>
           <w:lang w:val="ar_AE" w:bidi="ar_AE"/>
         </w:rPr>
         <w:t xml:space="preserve">قارن </w:t>
@@ -1535,6 +1901,8 @@
       <w:hyperlink r:id="rId51">
         <w:r>
           <w:rPr>
+            <w:rtl/>
+            <w:cs/>
             <w:lang w:val="ar_AE" w:bidi="ar_AE"/>
           </w:rPr>
           <w:rPr>
@@ -1546,17 +1914,23 @@
       </w:hyperlink>
       <w:r>
         <w:rPr>
+          <w:rtl/>
+          <w:cs/>
           <w:lang w:val="ar_AE" w:bidi="ar_AE"/>
         </w:rPr>
         <w:t>). • توهم أدوم والأمم المجاورة له أن التحالف مع نبوخذنصّر في عام 586 قبل الميلاد سيجلب لهم قسطًا من الراحة. ولكن وقت دينونتهم قد اقترب.</w:t>
       </w:r>
       <w:r>
         <w:rPr>
-          <w:lang w:val="ar_AE" w:bidi="ar_AE"/>
-        </w:rPr>
-      </w:r>
-      <w:r>
-        <w:rPr>
+          <w:rtl/>
+          <w:cs/>
+          <w:lang w:val="ar_AE" w:bidi="ar_AE"/>
+        </w:rPr>
+      </w:r>
+      <w:r>
+        <w:rPr>
+          <w:rtl/>
+          <w:cs/>
           <w:lang w:val="ar_AE" w:bidi="ar_AE"/>
         </w:rPr>
       </w:r>
@@ -1567,6 +1941,8 @@
       </w:pPr>
       <w:r>
         <w:rPr>
+          <w:rtl/>
+          <w:cs/>
           <w:lang w:val="ar_AE" w:bidi="ar_AE"/>
         </w:rPr>
       </w:r>
@@ -1578,12 +1954,16 @@
       </w:pPr>
       <w:r>
         <w:rPr>
+          <w:rtl/>
+          <w:cs/>
           <w:lang w:val="ar_AE" w:bidi="ar_AE"/>
         </w:rPr>
         <w:t>عوبديا 1: 12–14</w:t>
       </w:r>
       <w:r>
         <w:rPr>
+          <w:rtl/>
+          <w:cs/>
           <w:lang w:val="ar_AE" w:bidi="ar_AE"/>
         </w:rPr>
       </w:r>
@@ -1594,11 +1974,15 @@
       </w:pPr>
       <w:r>
         <w:rPr>
-          <w:lang w:val="ar_AE" w:bidi="ar_AE"/>
-        </w:rPr>
-      </w:r>
-      <w:r>
-        <w:rPr>
+          <w:rtl/>
+          <w:cs/>
+          <w:lang w:val="ar_AE" w:bidi="ar_AE"/>
+        </w:rPr>
+      </w:r>
+      <w:r>
+        <w:rPr>
+          <w:rtl/>
+          <w:cs/>
           <w:lang w:val="ar_AE" w:bidi="ar_AE"/>
         </w:rPr>
         <w:t xml:space="preserve">تُدان جميع الأمم على خطايا مشابهة لتلك التي ارتكبها أدوم (انظر، على سبيل المثال، النبوءات ضد جيران إسرائيل في </w:t>
@@ -1606,6 +1990,8 @@
       <w:hyperlink r:id="rId52">
         <w:r>
           <w:rPr>
+            <w:rtl/>
+            <w:cs/>
             <w:lang w:val="ar_AE" w:bidi="ar_AE"/>
           </w:rPr>
           <w:rPr>
@@ -1617,6 +2003,8 @@
       </w:hyperlink>
       <w:r>
         <w:rPr>
+          <w:rtl/>
+          <w:cs/>
           <w:lang w:val="ar_AE" w:bidi="ar_AE"/>
         </w:rPr>
         <w:t>). من بين الخطايا التي ارتكبها الأدوميون ضد يهوذا كانت مشاركتهم مع البابليين في نهب الأرض (</w:t>
@@ -1624,6 +2012,8 @@
       <w:hyperlink r:id="rId53">
         <w:r>
           <w:rPr>
+            <w:rtl/>
+            <w:cs/>
             <w:lang w:val="ar_AE" w:bidi="ar_AE"/>
           </w:rPr>
           <w:rPr>
@@ -1635,6 +2025,8 @@
       </w:hyperlink>
       <w:r>
         <w:rPr>
+          <w:rtl/>
+          <w:cs/>
           <w:lang w:val="ar_AE" w:bidi="ar_AE"/>
         </w:rPr>
         <w:t>) وقيامهم بقتل أو تسليم المنفلتين من يهوذا (</w:t>
@@ -1642,6 +2034,8 @@
       <w:hyperlink r:id="rId54">
         <w:r>
           <w:rPr>
+            <w:rtl/>
+            <w:cs/>
             <w:lang w:val="ar_AE" w:bidi="ar_AE"/>
           </w:rPr>
           <w:rPr>
@@ -1653,17 +2047,23 @@
       </w:hyperlink>
       <w:r>
         <w:rPr>
+          <w:rtl/>
+          <w:cs/>
           <w:lang w:val="ar_AE" w:bidi="ar_AE"/>
         </w:rPr>
         <w:t>).</w:t>
       </w:r>
       <w:r>
         <w:rPr>
-          <w:lang w:val="ar_AE" w:bidi="ar_AE"/>
-        </w:rPr>
-      </w:r>
-      <w:r>
-        <w:rPr>
+          <w:rtl/>
+          <w:cs/>
+          <w:lang w:val="ar_AE" w:bidi="ar_AE"/>
+        </w:rPr>
+      </w:r>
+      <w:r>
+        <w:rPr>
+          <w:rtl/>
+          <w:cs/>
           <w:lang w:val="ar_AE" w:bidi="ar_AE"/>
         </w:rPr>
       </w:r>
@@ -1674,6 +2074,8 @@
       </w:pPr>
       <w:r>
         <w:rPr>
+          <w:rtl/>
+          <w:cs/>
           <w:lang w:val="ar_AE" w:bidi="ar_AE"/>
         </w:rPr>
       </w:r>
@@ -1685,12 +2087,16 @@
       </w:pPr>
       <w:r>
         <w:rPr>
+          <w:rtl/>
+          <w:cs/>
           <w:lang w:val="ar_AE" w:bidi="ar_AE"/>
         </w:rPr>
         <w:t>عوبديا 1: 15</w:t>
       </w:r>
       <w:r>
         <w:rPr>
+          <w:rtl/>
+          <w:cs/>
           <w:lang w:val="ar_AE" w:bidi="ar_AE"/>
         </w:rPr>
       </w:r>
@@ -1701,11 +2107,15 @@
       </w:pPr>
       <w:r>
         <w:rPr>
-          <w:lang w:val="ar_AE" w:bidi="ar_AE"/>
-        </w:rPr>
-      </w:r>
-      <w:r>
-        <w:rPr>
+          <w:rtl/>
+          <w:cs/>
+          <w:lang w:val="ar_AE" w:bidi="ar_AE"/>
+        </w:rPr>
+      </w:r>
+      <w:r>
+        <w:rPr>
+          <w:rtl/>
+          <w:cs/>
           <w:lang w:val="ar_AE" w:bidi="ar_AE"/>
         </w:rPr>
         <w:t xml:space="preserve">فإنه قريب يوم الرب: رغم أن "يوم الرب" يشير في بعض النصوص إلى حدث زمني محدد ومؤقت (مثل دمار أدوم؛ أو ضربة أسراب الجراد في </w:t>
@@ -1713,6 +2123,8 @@
       <w:hyperlink r:id="rId55">
         <w:r>
           <w:rPr>
+            <w:rtl/>
+            <w:cs/>
             <w:lang w:val="ar_AE" w:bidi="ar_AE"/>
           </w:rPr>
           <w:rPr>
@@ -1724,17 +2136,23 @@
       </w:hyperlink>
       <w:r>
         <w:rPr>
+          <w:rtl/>
+          <w:cs/>
           <w:lang w:val="ar_AE" w:bidi="ar_AE"/>
         </w:rPr>
         <w:t>)، فإنه في جوهره يرمز إلى دينونة الله النهائية لجميع الأمم التي عصته. • كما فعلت: بالنسبة لأولئك الذين يواجهون الدينونة، فإن أعمالهم سترتد على رؤوسهم.</w:t>
       </w:r>
       <w:r>
         <w:rPr>
-          <w:lang w:val="ar_AE" w:bidi="ar_AE"/>
-        </w:rPr>
-      </w:r>
-      <w:r>
-        <w:rPr>
+          <w:rtl/>
+          <w:cs/>
+          <w:lang w:val="ar_AE" w:bidi="ar_AE"/>
+        </w:rPr>
+      </w:r>
+      <w:r>
+        <w:rPr>
+          <w:rtl/>
+          <w:cs/>
           <w:lang w:val="ar_AE" w:bidi="ar_AE"/>
         </w:rPr>
       </w:r>
@@ -1745,6 +2163,8 @@
       </w:pPr>
       <w:r>
         <w:rPr>
+          <w:rtl/>
+          <w:cs/>
           <w:lang w:val="ar_AE" w:bidi="ar_AE"/>
         </w:rPr>
       </w:r>
@@ -1756,12 +2176,16 @@
       </w:pPr>
       <w:r>
         <w:rPr>
+          <w:rtl/>
+          <w:cs/>
           <w:lang w:val="ar_AE" w:bidi="ar_AE"/>
         </w:rPr>
         <w:t>عوبديا 1: 15–18</w:t>
       </w:r>
       <w:r>
         <w:rPr>
+          <w:rtl/>
+          <w:cs/>
           <w:lang w:val="ar_AE" w:bidi="ar_AE"/>
         </w:rPr>
       </w:r>
@@ -1772,11 +2196,15 @@
       </w:pPr>
       <w:r>
         <w:rPr>
-          <w:lang w:val="ar_AE" w:bidi="ar_AE"/>
-        </w:rPr>
-      </w:r>
-      <w:r>
-        <w:rPr>
+          <w:rtl/>
+          <w:cs/>
+          <w:lang w:val="ar_AE" w:bidi="ar_AE"/>
+        </w:rPr>
+      </w:r>
+      <w:r>
+        <w:rPr>
+          <w:rtl/>
+          <w:cs/>
           <w:lang w:val="ar_AE" w:bidi="ar_AE"/>
         </w:rPr>
         <w:t>شريعة الجزاء بالمثل (</w:t>
@@ -1784,12 +2212,16 @@
       <w:r>
         <w:rPr>
           <w:i/>
+          <w:rtl/>
+          <w:cs/>
           <w:lang w:val="ar_AE" w:bidi="ar_AE"/>
         </w:rPr>
         <w:t>lex talionis</w:t>
       </w:r>
       <w:r>
         <w:rPr>
+          <w:rtl/>
+          <w:cs/>
           <w:lang w:val="ar_AE" w:bidi="ar_AE"/>
         </w:rPr>
         <w:t xml:space="preserve">) تنص على أن ما يزرعه الإنسان إياه يحصد. لقد كانت خيانة أدوم، والتي تفاقمت بعجرفته، سببًا في أن يرتد عمله على رأسه مضاعفًا حين أتى وقت الدينونة. وهكذا يحقق عدل الله خلاصًا لإسرائيل ودينونة لأدوم (انظر أيضًا </w:t>
@@ -1797,6 +2229,8 @@
       <w:hyperlink r:id="rId28">
         <w:r>
           <w:rPr>
+            <w:rtl/>
+            <w:cs/>
             <w:lang w:val="ar_AE" w:bidi="ar_AE"/>
           </w:rPr>
           <w:rPr>
@@ -1808,6 +2242,8 @@
       </w:hyperlink>
       <w:r>
         <w:rPr>
+          <w:rtl/>
+          <w:cs/>
           <w:lang w:val="ar_AE" w:bidi="ar_AE"/>
         </w:rPr>
         <w:t xml:space="preserve"> </w:t>
@@ -1815,6 +2251,8 @@
       <w:hyperlink r:id="rId34">
         <w:r>
           <w:rPr>
+            <w:rtl/>
+            <w:cs/>
             <w:lang w:val="ar_AE" w:bidi="ar_AE"/>
           </w:rPr>
           <w:rPr>
@@ -1826,6 +2264,8 @@
       </w:hyperlink>
       <w:r>
         <w:rPr>
+          <w:rtl/>
+          <w:cs/>
           <w:lang w:val="ar_AE" w:bidi="ar_AE"/>
         </w:rPr>
         <w:t xml:space="preserve"> </w:t>
@@ -1833,6 +2273,8 @@
       <w:hyperlink r:id="rId56">
         <w:r>
           <w:rPr>
+            <w:rtl/>
+            <w:cs/>
             <w:lang w:val="ar_AE" w:bidi="ar_AE"/>
           </w:rPr>
           <w:rPr>
@@ -1844,17 +2286,23 @@
       </w:hyperlink>
       <w:r>
         <w:rPr>
+          <w:rtl/>
+          <w:cs/>
           <w:lang w:val="ar_AE" w:bidi="ar_AE"/>
         </w:rPr>
         <w:t>).</w:t>
       </w:r>
       <w:r>
         <w:rPr>
-          <w:lang w:val="ar_AE" w:bidi="ar_AE"/>
-        </w:rPr>
-      </w:r>
-      <w:r>
-        <w:rPr>
+          <w:rtl/>
+          <w:cs/>
+          <w:lang w:val="ar_AE" w:bidi="ar_AE"/>
+        </w:rPr>
+      </w:r>
+      <w:r>
+        <w:rPr>
+          <w:rtl/>
+          <w:cs/>
           <w:lang w:val="ar_AE" w:bidi="ar_AE"/>
         </w:rPr>
       </w:r>
@@ -1865,6 +2313,8 @@
       </w:pPr>
       <w:r>
         <w:rPr>
+          <w:rtl/>
+          <w:cs/>
           <w:lang w:val="ar_AE" w:bidi="ar_AE"/>
         </w:rPr>
       </w:r>
@@ -1876,12 +2326,16 @@
       </w:pPr>
       <w:r>
         <w:rPr>
+          <w:rtl/>
+          <w:cs/>
           <w:lang w:val="ar_AE" w:bidi="ar_AE"/>
         </w:rPr>
         <w:t>عوبديا 1: 17</w:t>
       </w:r>
       <w:r>
         <w:rPr>
+          <w:rtl/>
+          <w:cs/>
           <w:lang w:val="ar_AE" w:bidi="ar_AE"/>
         </w:rPr>
       </w:r>
@@ -1892,11 +2346,15 @@
       </w:pPr>
       <w:r>
         <w:rPr>
-          <w:lang w:val="ar_AE" w:bidi="ar_AE"/>
-        </w:rPr>
-      </w:r>
-      <w:r>
-        <w:rPr>
+          <w:rtl/>
+          <w:cs/>
+          <w:lang w:val="ar_AE" w:bidi="ar_AE"/>
+        </w:rPr>
+      </w:r>
+      <w:r>
+        <w:rPr>
+          <w:rtl/>
+          <w:cs/>
           <w:lang w:val="ar_AE" w:bidi="ar_AE"/>
         </w:rPr>
         <w:t xml:space="preserve">ستصبح أورشليم ملاذًا للفارين. وقد بقيت بقية ليهوذا فيها (انظر </w:t>
@@ -1904,6 +2362,8 @@
       <w:hyperlink r:id="rId57">
         <w:r>
           <w:rPr>
+            <w:rtl/>
+            <w:cs/>
             <w:lang w:val="ar_AE" w:bidi="ar_AE"/>
           </w:rPr>
           <w:rPr>
@@ -1915,6 +2375,8 @@
       </w:hyperlink>
       <w:r>
         <w:rPr>
+          <w:rtl/>
+          <w:cs/>
           <w:lang w:val="ar_AE" w:bidi="ar_AE"/>
         </w:rPr>
         <w:t>). جبل الرب، حيث تكون النجاة، يتناقض بوضوح مع حصون أدوم التي لم تصمد. • مواريثهم: الأرض التي وهبها الله لإبراهيم (</w:t>
@@ -1922,6 +2384,8 @@
       <w:hyperlink r:id="rId58">
         <w:r>
           <w:rPr>
+            <w:rtl/>
+            <w:cs/>
             <w:lang w:val="ar_AE" w:bidi="ar_AE"/>
           </w:rPr>
           <w:rPr>
@@ -1933,6 +2397,8 @@
       </w:hyperlink>
       <w:r>
         <w:rPr>
+          <w:rtl/>
+          <w:cs/>
           <w:lang w:val="ar_AE" w:bidi="ar_AE"/>
         </w:rPr>
         <w:t>) سُتسترد لنسله، لتظل لهم ميراثًا أبديًا. • شعب إسرائيل: هذا الوعد بعودة شعب يهوذا دون أدوم أكد عليه النبي ملاخي (</w:t>
@@ -1940,6 +2406,8 @@
       <w:hyperlink r:id="rId59">
         <w:r>
           <w:rPr>
+            <w:rtl/>
+            <w:cs/>
             <w:lang w:val="ar_AE" w:bidi="ar_AE"/>
           </w:rPr>
           <w:rPr>
@@ -1951,17 +2419,23 @@
       </w:hyperlink>
       <w:r>
         <w:rPr>
+          <w:rtl/>
+          <w:cs/>
           <w:lang w:val="ar_AE" w:bidi="ar_AE"/>
         </w:rPr>
         <w:t>).</w:t>
       </w:r>
       <w:r>
         <w:rPr>
-          <w:lang w:val="ar_AE" w:bidi="ar_AE"/>
-        </w:rPr>
-      </w:r>
-      <w:r>
-        <w:rPr>
+          <w:rtl/>
+          <w:cs/>
+          <w:lang w:val="ar_AE" w:bidi="ar_AE"/>
+        </w:rPr>
+      </w:r>
+      <w:r>
+        <w:rPr>
+          <w:rtl/>
+          <w:cs/>
           <w:lang w:val="ar_AE" w:bidi="ar_AE"/>
         </w:rPr>
       </w:r>
@@ -1972,6 +2446,8 @@
       </w:pPr>
       <w:r>
         <w:rPr>
+          <w:rtl/>
+          <w:cs/>
           <w:lang w:val="ar_AE" w:bidi="ar_AE"/>
         </w:rPr>
       </w:r>
@@ -1983,12 +2459,16 @@
       </w:pPr>
       <w:r>
         <w:rPr>
+          <w:rtl/>
+          <w:cs/>
           <w:lang w:val="ar_AE" w:bidi="ar_AE"/>
         </w:rPr>
         <w:t>عوبديا 1: 18</w:t>
       </w:r>
       <w:r>
         <w:rPr>
+          <w:rtl/>
+          <w:cs/>
           <w:lang w:val="ar_AE" w:bidi="ar_AE"/>
         </w:rPr>
       </w:r>
@@ -1999,22 +2479,30 @@
       </w:pPr>
       <w:r>
         <w:rPr>
-          <w:lang w:val="ar_AE" w:bidi="ar_AE"/>
-        </w:rPr>
-      </w:r>
-      <w:r>
-        <w:rPr>
+          <w:rtl/>
+          <w:cs/>
+          <w:lang w:val="ar_AE" w:bidi="ar_AE"/>
+        </w:rPr>
+      </w:r>
+      <w:r>
+        <w:rPr>
+          <w:rtl/>
+          <w:cs/>
           <w:lang w:val="ar_AE" w:bidi="ar_AE"/>
         </w:rPr>
         <w:t>يتجلى مبدأ القصاص في مشهد نار عارمة تلتهم أدوم حتى الفَنَاء. فقد أُحرقت مدن أدوم على يد الملك البابلي نابونيدوس في عام 553 قبل الميلاد.</w:t>
       </w:r>
       <w:r>
         <w:rPr>
-          <w:lang w:val="ar_AE" w:bidi="ar_AE"/>
-        </w:rPr>
-      </w:r>
-      <w:r>
-        <w:rPr>
+          <w:rtl/>
+          <w:cs/>
+          <w:lang w:val="ar_AE" w:bidi="ar_AE"/>
+        </w:rPr>
+      </w:r>
+      <w:r>
+        <w:rPr>
+          <w:rtl/>
+          <w:cs/>
           <w:lang w:val="ar_AE" w:bidi="ar_AE"/>
         </w:rPr>
       </w:r>
@@ -2025,6 +2513,8 @@
       </w:pPr>
       <w:r>
         <w:rPr>
+          <w:rtl/>
+          <w:cs/>
           <w:lang w:val="ar_AE" w:bidi="ar_AE"/>
         </w:rPr>
       </w:r>
@@ -2036,12 +2526,16 @@
       </w:pPr>
       <w:r>
         <w:rPr>
+          <w:rtl/>
+          <w:cs/>
           <w:lang w:val="ar_AE" w:bidi="ar_AE"/>
         </w:rPr>
         <w:t>عوبديا 1: 19–20</w:t>
       </w:r>
       <w:r>
         <w:rPr>
+          <w:rtl/>
+          <w:cs/>
           <w:lang w:val="ar_AE" w:bidi="ar_AE"/>
         </w:rPr>
       </w:r>
@@ -2052,11 +2546,15 @@
       </w:pPr>
       <w:r>
         <w:rPr>
-          <w:lang w:val="ar_AE" w:bidi="ar_AE"/>
-        </w:rPr>
-      </w:r>
-      <w:r>
-        <w:rPr>
+          <w:rtl/>
+          <w:cs/>
+          <w:lang w:val="ar_AE" w:bidi="ar_AE"/>
+        </w:rPr>
+      </w:r>
+      <w:r>
+        <w:rPr>
+          <w:rtl/>
+          <w:cs/>
           <w:lang w:val="ar_AE" w:bidi="ar_AE"/>
         </w:rPr>
         <w:t xml:space="preserve">ويرث شعب الله الساكنون في النقب (الجَنُوب)، وسفوح يهوذا، وبنيامين (وهي ثلاث مناطق في يهوذا) أراضي جيرانهم (أدوم، وسهل الفلسطينيين، وجلعاد). وبنو إسرائيل العائدون من السبي سيستردون منطقتي أفرايم والسامرة (اللتان استولى عليهما أشور في 722 – 721 قبل الميلاد) كما سيوسعون تخمهم لتشمل الأراضي التي وُعدوا بامتلاكها عند الفتح (سهول الفلسطينيين، وأرض جلعاد، وساحل فينيقيا). انظر أيضًا </w:t>
@@ -2064,6 +2562,8 @@
       <w:hyperlink r:id="rId60">
         <w:r>
           <w:rPr>
+            <w:rtl/>
+            <w:cs/>
             <w:lang w:val="ar_AE" w:bidi="ar_AE"/>
           </w:rPr>
           <w:rPr>
@@ -2075,17 +2575,23 @@
       </w:hyperlink>
       <w:r>
         <w:rPr>
+          <w:rtl/>
+          <w:cs/>
           <w:lang w:val="ar_AE" w:bidi="ar_AE"/>
         </w:rPr>
         <w:t>.</w:t>
       </w:r>
       <w:r>
         <w:rPr>
-          <w:lang w:val="ar_AE" w:bidi="ar_AE"/>
-        </w:rPr>
-      </w:r>
-      <w:r>
-        <w:rPr>
+          <w:rtl/>
+          <w:cs/>
+          <w:lang w:val="ar_AE" w:bidi="ar_AE"/>
+        </w:rPr>
+      </w:r>
+      <w:r>
+        <w:rPr>
+          <w:rtl/>
+          <w:cs/>
           <w:lang w:val="ar_AE" w:bidi="ar_AE"/>
         </w:rPr>
       </w:r>
@@ -2096,6 +2602,8 @@
       </w:pPr>
       <w:r>
         <w:rPr>
+          <w:rtl/>
+          <w:cs/>
           <w:lang w:val="ar_AE" w:bidi="ar_AE"/>
         </w:rPr>
       </w:r>
@@ -2107,12 +2615,16 @@
       </w:pPr>
       <w:r>
         <w:rPr>
+          <w:rtl/>
+          <w:cs/>
           <w:lang w:val="ar_AE" w:bidi="ar_AE"/>
         </w:rPr>
         <w:t>عوبديا 1: 19–21</w:t>
       </w:r>
       <w:r>
         <w:rPr>
+          <w:rtl/>
+          <w:cs/>
           <w:lang w:val="ar_AE" w:bidi="ar_AE"/>
         </w:rPr>
       </w:r>
@@ -2123,22 +2635,30 @@
       </w:pPr>
       <w:r>
         <w:rPr>
-          <w:lang w:val="ar_AE" w:bidi="ar_AE"/>
-        </w:rPr>
-      </w:r>
-      <w:r>
-        <w:rPr>
+          <w:rtl/>
+          <w:cs/>
+          <w:lang w:val="ar_AE" w:bidi="ar_AE"/>
+        </w:rPr>
+      </w:r>
+      <w:r>
+        <w:rPr>
+          <w:rtl/>
+          <w:cs/>
           <w:lang w:val="ar_AE" w:bidi="ar_AE"/>
         </w:rPr>
         <w:t>إن التاريخ يمهد لليوم الذي سيصير فيه العالم كله ملكًا للرب. هذه الرسالة هي تشجيع لشعب الله وإنذار للأمم الغافلة عنه.</w:t>
       </w:r>
       <w:r>
         <w:rPr>
-          <w:lang w:val="ar_AE" w:bidi="ar_AE"/>
-        </w:rPr>
-      </w:r>
-      <w:r>
-        <w:rPr>
+          <w:rtl/>
+          <w:cs/>
+          <w:lang w:val="ar_AE" w:bidi="ar_AE"/>
+        </w:rPr>
+      </w:r>
+      <w:r>
+        <w:rPr>
+          <w:rtl/>
+          <w:cs/>
           <w:lang w:val="ar_AE" w:bidi="ar_AE"/>
         </w:rPr>
       </w:r>
@@ -2149,6 +2669,8 @@
       </w:pPr>
       <w:r>
         <w:rPr>
+          <w:rtl/>
+          <w:cs/>
           <w:lang w:val="ar_AE" w:bidi="ar_AE"/>
         </w:rPr>
       </w:r>
@@ -2160,12 +2682,16 @@
       </w:pPr>
       <w:r>
         <w:rPr>
+          <w:rtl/>
+          <w:cs/>
           <w:lang w:val="ar_AE" w:bidi="ar_AE"/>
         </w:rPr>
         <w:t>عوبديا 1: 20</w:t>
       </w:r>
       <w:r>
         <w:rPr>
+          <w:rtl/>
+          <w:cs/>
           <w:lang w:val="ar_AE" w:bidi="ar_AE"/>
         </w:rPr>
       </w:r>
@@ -2176,17 +2702,23 @@
       </w:pPr>
       <w:r>
         <w:rPr>
-          <w:lang w:val="ar_AE" w:bidi="ar_AE"/>
-        </w:rPr>
-      </w:r>
-      <w:r>
-        <w:rPr>
+          <w:rtl/>
+          <w:cs/>
+          <w:lang w:val="ar_AE" w:bidi="ar_AE"/>
+        </w:rPr>
+      </w:r>
+      <w:r>
+        <w:rPr>
+          <w:rtl/>
+          <w:cs/>
           <w:lang w:val="ar_AE" w:bidi="ar_AE"/>
         </w:rPr>
         <w:t xml:space="preserve">في الشمال: سبي أورشليم الذين في </w:t>
       </w:r>
       <w:r>
         <w:rPr>
+          <w:rtl/>
+          <w:cs/>
           <w:lang w:val="ar_AE" w:bidi="ar_AE"/>
         </w:rPr>
         <w:t>صَفَارِد</w:t>
@@ -2194,23 +2726,31 @@
       <w:r>
         <w:rPr>
           <w:i/>
+          <w:rtl/>
+          <w:cs/>
           <w:lang w:val="ar_AE" w:bidi="ar_AE"/>
         </w:rPr>
         <w:t>،</w:t>
       </w:r>
       <w:r>
         <w:rPr>
+          <w:rtl/>
+          <w:cs/>
           <w:lang w:val="ar_AE" w:bidi="ar_AE"/>
         </w:rPr>
         <w:t xml:space="preserve"> وهي ربما مستعمرة من اليهود المسبيين في آسيا الصغرى، سيعودون إلى النقب. يتوافق المشهد مع بعض الأحداث التي وقعت فعلًا، لكنه لا يقتصر عليها فحسب، بل يشير إلى ما سيحدث في نهاية الأزمان.</w:t>
       </w:r>
       <w:r>
         <w:rPr>
-          <w:lang w:val="ar_AE" w:bidi="ar_AE"/>
-        </w:rPr>
-      </w:r>
-      <w:r>
-        <w:rPr>
+          <w:rtl/>
+          <w:cs/>
+          <w:lang w:val="ar_AE" w:bidi="ar_AE"/>
+        </w:rPr>
+      </w:r>
+      <w:r>
+        <w:rPr>
+          <w:rtl/>
+          <w:cs/>
           <w:lang w:val="ar_AE" w:bidi="ar_AE"/>
         </w:rPr>
       </w:r>
@@ -2221,6 +2761,8 @@
       </w:pPr>
       <w:r>
         <w:rPr>
+          <w:rtl/>
+          <w:cs/>
           <w:lang w:val="ar_AE" w:bidi="ar_AE"/>
         </w:rPr>
       </w:r>
@@ -2232,12 +2774,16 @@
       </w:pPr>
       <w:r>
         <w:rPr>
+          <w:rtl/>
+          <w:cs/>
           <w:lang w:val="ar_AE" w:bidi="ar_AE"/>
         </w:rPr>
         <w:t>عوبديا 1: 21</w:t>
       </w:r>
       <w:r>
         <w:rPr>
+          <w:rtl/>
+          <w:cs/>
           <w:lang w:val="ar_AE" w:bidi="ar_AE"/>
         </w:rPr>
       </w:r>
@@ -2248,28 +2794,38 @@
       </w:pPr>
       <w:r>
         <w:rPr>
-          <w:lang w:val="ar_AE" w:bidi="ar_AE"/>
-        </w:rPr>
-      </w:r>
-      <w:r>
-        <w:rPr>
+          <w:rtl/>
+          <w:cs/>
+          <w:lang w:val="ar_AE" w:bidi="ar_AE"/>
+        </w:rPr>
+      </w:r>
+      <w:r>
+        <w:rPr>
+          <w:rtl/>
+          <w:cs/>
           <w:lang w:val="ar_AE" w:bidi="ar_AE"/>
         </w:rPr>
         <w:t>عَلَى جَبَل صِهْيَوْن</w:t>
       </w:r>
       <w:r>
         <w:rPr>
+          <w:rtl/>
+          <w:cs/>
           <w:lang w:val="ar_AE" w:bidi="ar_AE"/>
         </w:rPr>
         <w:t>: يصعد شعب الله على جبله المقدس ليحكموا (يدينوا) جبل عدوهم القديم، أدوم، تمهيدًا لقيام مُلك الرب.</w:t>
       </w:r>
       <w:r>
         <w:rPr>
-          <w:lang w:val="ar_AE" w:bidi="ar_AE"/>
-        </w:rPr>
-      </w:r>
-      <w:r>
-        <w:rPr>
+          <w:rtl/>
+          <w:cs/>
+          <w:lang w:val="ar_AE" w:bidi="ar_AE"/>
+        </w:rPr>
+      </w:r>
+      <w:r>
+        <w:rPr>
+          <w:rtl/>
+          <w:cs/>
           <w:lang w:val="ar_AE" w:bidi="ar_AE"/>
         </w:rPr>
       </w:r>

</xml_diff>